<commit_message>
MOO-141: gate 4's cap limb is closed — three gates remain
Co-Authored-By: Claude Opus 5 <noreply@anthropic.com>
</commit_message>
<xml_diff>
--- a/moo141-base-recheck-rev61.docx
+++ b/moo141-base-recheck-rev61.docx
@@ -1182,21 +1182,12 @@
         <w:pStyle w:val="Heading2"/>
       </w:pPr>
       <w:r>
-        <w:t>6. Finding 3 — MOO-170's chaining price is in the repository and is priced on the superseded figure</w:t>
+        <w:t>6. Gate 4's cap limb closed while I was writing this</w:t>
       </w:r>
     </w:p>
     <w:p>
       <w:r>
-        <w:t>MOO-170's bounded addendum is committed (</w:t>
-      </w:r>
-      <w:r>
-        <w:rPr>
-          <w:rFonts w:ascii="Consolas" w:hAnsi="Consolas"/>
-        </w:rPr>
-        <w:t>f2f8458</w:t>
-      </w:r>
-      <w:r>
-        <w:t xml:space="preserve">) and answers the chaining question: </w:t>
+        <w:t xml:space="preserve">MOO-170's bounded addendum answers the chaining question: </w:t>
       </w:r>
       <w:r>
         <w:rPr>
@@ -1205,7 +1196,13 @@
         <w:t>the $204,000 bound is analytic, survives chaining unchanged, stays lapse rather than cost, and the central estimate is $0 at every chain length including an unbounded one.</w:t>
       </w:r>
       <w:r>
-        <w:t xml:space="preserve"> Displacement rises about 21× — 0.14 to 2.80 members over 48 months — and stays inside the resolution of the inputs by a narrower margin.</w:t>
+        <w:t xml:space="preserve"> Displacement rises about 21× — 0.14 to 2.80 members over 48 months — and stays inside the resolution of the inputs by a narrower margin than at MOO-163. </w:t>
+      </w:r>
+      <w:r>
+        <w:rPr>
+          <w:b/>
+        </w:rPr>
+        <w:t>MOO-170 is `done`.</w:t>
       </w:r>
     </w:p>
     <w:p>
@@ -1213,73 +1210,54 @@
         <w:rPr>
           <w:b/>
         </w:rPr>
-        <w:t>Two things about it.</w:t>
+        <w:t>On that input F-6's cap stays declined</w:t>
       </w:r>
       <w:r>
-        <w:t xml:space="preserve"> It is priced on the </w:t>
+        <w:t xml:space="preserve"> — </w:t>
+      </w:r>
+      <w:r>
+        <w:rPr>
+          <w:rFonts w:ascii="Consolas" w:hAnsi="Consolas"/>
+        </w:rPr>
+        <w:t>moo179-cap-decision.md</w:t>
+      </w:r>
+      <w:r>
+        <w:t xml:space="preserve">, committed at </w:t>
+      </w:r>
+      <w:r>
+        <w:rPr>
+          <w:rFonts w:ascii="Consolas" w:hAnsi="Consolas"/>
+        </w:rPr>
+        <w:t>789eb89</w:t>
+      </w:r>
+      <w:r>
+        <w:t xml:space="preserve">. The one thing I would have asked of it is already answered there: the bound's ground is that it quantifies over any vector of ordering dates, so </w:t>
       </w:r>
       <w:r>
         <w:rPr>
           <w:b/>
         </w:rPr>
-        <w:t>30-day</w:t>
+        <w:t>it is figure-independent as well as length-independent</w:t>
       </w:r>
       <w:r>
-        <w:t xml:space="preserve"> retention, which </w:t>
+        <w:t xml:space="preserve">, and the board's move from 30 days to 120 does not revive the cap. </w:t>
       </w:r>
       <w:r>
         <w:rPr>
           <w:b/>
         </w:rPr>
-        <w:t>the board superseded at 120 days at 17:14</w:t>
+        <w:t>Trigger 2 is untouched — if MOO-49's clause (vi) lands broad, the cap and MOO-163 re-open together.</w:t>
       </w:r>
-      <w:r>
-        <w:t xml:space="preserve">, three hours after the model was built. The stated ground for the bound is that it </w:t>
-      </w:r>
-      <w:r>
-        <w:rPr>
-          <w:i/>
-        </w:rPr>
-        <w:t>"quantifies over any vector of ordering dates"</w:t>
-      </w:r>
-      <w:r>
-        <w:t xml:space="preserve"> and that </w:t>
-      </w:r>
-      <w:r>
-        <w:rPr>
-          <w:i/>
-        </w:rPr>
-        <w:t>"there is no `k` in the derivation"</w:t>
-      </w:r>
-      <w:r>
-        <w:t xml:space="preserve"> — which, if it holds, makes the bound </w:t>
-      </w:r>
+    </w:p>
+    <w:p>
       <w:r>
         <w:rPr>
           <w:b/>
         </w:rPr>
-        <w:t>figure-independent as well as length-independent</w:t>
+        <w:t>So gate 4 is now only the bounded re-review of revision 6</w:t>
       </w:r>
       <w:r>
-        <w:t xml:space="preserve">. That is exactly the question MOO-179 turns on and </w:t>
-      </w:r>
-      <w:r>
-        <w:rPr>
-          <w:b/>
-        </w:rPr>
-        <w:t>I am not deciding it in this document.</w:t>
-      </w:r>
-      <w:r>
-        <w:t xml:space="preserve"> Second, </w:t>
-      </w:r>
-      <w:r>
-        <w:rPr>
-          <w:b/>
-        </w:rPr>
-        <w:t>MOO-170 is still `in_progress` and its last event is a terminal limit failure</w:t>
-      </w:r>
-      <w:r>
-        <w:t>, so the answer is in the repository and not on the issue. Named unblock action posted there.</w:t>
+        <w:t>, and §4 above is the second named target for it, alongside Edit 3's figure and the broken 30-day identity.</w:t>
       </w:r>
     </w:p>
     <w:p>
@@ -1511,7 +1489,7 @@
               <w:rPr>
                 <w:b/>
               </w:rPr>
-              <w:t>MOO-179</w:t>
+              <w:t>MOO-176</w:t>
             </w:r>
           </w:p>
         </w:tc>
@@ -1521,7 +1499,25 @@
           </w:tcPr>
           <w:p>
             <w:r>
-              <w:t>F-6's cap decision, held on MOO-170's chaining price, which §6 reports</w:t>
+              <w:t xml:space="preserve">Revision 6 passes </w:t>
+            </w:r>
+            <w:r>
+              <w:rPr>
+                <w:b/>
+              </w:rPr>
+              <w:t>one</w:t>
+            </w:r>
+            <w:r>
+              <w:t xml:space="preserve"> bounded re-review — Edit 3's figure, the broken 30-day identity, and §4 above. </w:t>
+            </w:r>
+            <w:r>
+              <w:rPr>
+                <w:b/>
+              </w:rPr>
+              <w:t>Its cap limb is closed</w:t>
+            </w:r>
+            <w:r>
+              <w:t>: §6</w:t>
             </w:r>
           </w:p>
         </w:tc>
@@ -1568,10 +1564,15 @@
         <w:rPr>
           <w:b/>
         </w:rPr>
-        <w:t>I did not decide F-6's cap.</w:t>
+        <w:t>I did not decide F-6's cap here.</w:t>
       </w:r>
       <w:r>
-        <w:t xml:space="preserve"> It is MOO-179's and it waits on MOO-170.</w:t>
+        <w:t xml:space="preserve"> It is MOO-179's, it is taken there on MOO-170's price, and §6</w:t>
+      </w:r>
+    </w:p>
+    <w:p>
+      <w:r>
+        <w:t>records it rather than re-deciding it.</w:t>
       </w:r>
     </w:p>
     <w:p>

</xml_diff>

<commit_message>
MOO-141: correct the direction of the document-size movement in the rev-61 re-check
Co-Authored-By: Claude Opus 5 <noreply@anthropic.com>
</commit_message>
<xml_diff>
--- a/moo141-base-recheck-rev61.docx
+++ b/moo141-base-recheck-rev61.docx
@@ -268,10 +268,10 @@
         <w:rPr>
           <w:b/>
         </w:rPr>
-        <w:t>The whole document shrank by 21,362 characters and the enacted text shrank by 2,279.</w:t>
+        <w:t>The whole document grew by 21,382 characters while the enacted text shrank by 2,279.</w:t>
       </w:r>
       <w:r>
-        <w:t xml:space="preserve"> The first is the record moving out again; the second is store revision 61 curing its fatal finding </w:t>
+        <w:t xml:space="preserve"> The growth is store revision 61's own record; the shrinkage is store revision 61 curing its fatal finding </w:t>
       </w:r>
       <w:r>
         <w:rPr>
@@ -280,7 +280,16 @@
         <w:t>by deleting words</w:t>
       </w:r>
       <w:r>
-        <w:t>, which is what its own §0.0-61 says it did.</w:t>
+        <w:t xml:space="preserve">, which is what its own §0.0-61 says it did. </w:t>
+      </w:r>
+      <w:r>
+        <w:rPr>
+          <w:b/>
+        </w:rPr>
+        <w:t>The two move in opposite directions, so document size is not a proxy for whether the bill moved</w:t>
+      </w:r>
+      <w:r>
+        <w:t xml:space="preserve"> — which is the same lesson as the anchors.</w:t>
       </w:r>
     </w:p>
     <w:p>

</xml_diff>